<commit_message>
Generated 1:1 dedicated task-wise screenshots for Experiments 1-5 and updated writeups
</commit_message>
<xml_diff>
--- a/writeups/Experiment_2_CSS3_Writeup.docx
+++ b/writeups/Experiment_2_CSS3_Writeup.docx
@@ -2730,7 +2730,7 @@
           <w:color w:val="800000"/>
           <w:sz w:val="20"/>
         </w:rPr>
-        <w:t>Task 1 &amp; 2: Inline Header and Internal Navigation Bar</w:t>
+        <w:t>Task 1: Style Homepage Header (Inline CSS)</w:t>
       </w:r>
     </w:p>
     <w:p>
@@ -2741,7 +2741,7 @@
       <w:r>
         <w:drawing>
           <wp:inline xmlns:a="http://schemas.openxmlformats.org/drawingml/2006/main" xmlns:pic="http://schemas.openxmlformats.org/drawingml/2006/picture">
-            <wp:extent cx="5486400" cy="1995055"/>
+            <wp:extent cx="5486400" cy="1673817"/>
             <wp:docPr id="2" name="Picture 2"/>
             <wp:cNvGraphicFramePr>
               <a:graphicFrameLocks noChangeAspect="1"/>
@@ -2762,7 +2762,7 @@
                   <pic:spPr>
                     <a:xfrm>
                       <a:off x="0" y="0"/>
-                      <a:ext cx="5486400" cy="1995055"/>
+                      <a:ext cx="5486400" cy="1673817"/>
                     </a:xfrm>
                     <a:prstGeom prst="rect"/>
                   </pic:spPr>
@@ -2783,7 +2783,7 @@
           <w:color w:val="800000"/>
           <w:sz w:val="20"/>
         </w:rPr>
-        <w:t>Task 3, 9 &amp; 10: Complete Page Layout, Left Sidebar, Glowing Alert, and Overview</w:t>
+        <w:t>Task 2: Internal CSS for Navigation Menu (&lt;style&gt; tag)</w:t>
       </w:r>
     </w:p>
     <w:p>
@@ -2794,7 +2794,7 @@
       <w:r>
         <w:drawing>
           <wp:inline xmlns:a="http://schemas.openxmlformats.org/drawingml/2006/main" xmlns:pic="http://schemas.openxmlformats.org/drawingml/2006/picture">
-            <wp:extent cx="5486400" cy="4343400"/>
+            <wp:extent cx="5486400" cy="1394847"/>
             <wp:docPr id="3" name="Picture 3"/>
             <wp:cNvGraphicFramePr>
               <a:graphicFrameLocks noChangeAspect="1"/>
@@ -2803,7 +2803,7 @@
               <a:graphicData uri="http://schemas.openxmlformats.org/drawingml/2006/picture">
                 <pic:pic>
                   <pic:nvPicPr>
-                    <pic:cNvPr id="0" name="exp2_homepage_overview.png"/>
+                    <pic:cNvPr id="0" name="exp2_task2_internal_nav.png"/>
                     <pic:cNvPicPr/>
                   </pic:nvPicPr>
                   <pic:blipFill>
@@ -2815,7 +2815,7 @@
                   <pic:spPr>
                     <a:xfrm>
                       <a:off x="0" y="0"/>
-                      <a:ext cx="5486400" cy="4343400"/>
+                      <a:ext cx="5486400" cy="1394847"/>
                     </a:xfrm>
                     <a:prstGeom prst="rect"/>
                   </pic:spPr>
@@ -2836,7 +2836,7 @@
           <w:color w:val="800000"/>
           <w:sz w:val="20"/>
         </w:rPr>
-        <w:t>Task 4, 5 &amp; 6: Categories Sidebar, Box Model Advisory Cards, and Image Gallery</w:t>
+        <w:t>Task 3: External CSS for Whole Website Theme (style.css)</w:t>
       </w:r>
     </w:p>
     <w:p>
@@ -2847,7 +2847,7 @@
       <w:r>
         <w:drawing>
           <wp:inline xmlns:a="http://schemas.openxmlformats.org/drawingml/2006/main" xmlns:pic="http://schemas.openxmlformats.org/drawingml/2006/picture">
-            <wp:extent cx="5486400" cy="3886200"/>
+            <wp:extent cx="5486400" cy="4071938"/>
             <wp:docPr id="4" name="Picture 4"/>
             <wp:cNvGraphicFramePr>
               <a:graphicFrameLocks noChangeAspect="1"/>
@@ -2856,7 +2856,7 @@
               <a:graphicData uri="http://schemas.openxmlformats.org/drawingml/2006/picture">
                 <pic:pic>
                   <pic:nvPicPr>
-                    <pic:cNvPr id="0" name="exp2_task4_sidebar_cards.png"/>
+                    <pic:cNvPr id="0" name="exp2_task3_external_theme.png"/>
                     <pic:cNvPicPr/>
                   </pic:nvPicPr>
                   <pic:blipFill>
@@ -2868,7 +2868,7 @@
                   <pic:spPr>
                     <a:xfrm>
                       <a:off x="0" y="0"/>
-                      <a:ext cx="5486400" cy="3886200"/>
+                      <a:ext cx="5486400" cy="4071938"/>
                     </a:xfrm>
                     <a:prstGeom prst="rect"/>
                   </pic:spPr>
@@ -2889,7 +2889,166 @@
           <w:color w:val="800000"/>
           <w:sz w:val="20"/>
         </w:rPr>
-        <w:t>Task 7: Styled Irrigation Schedule Table with Zebra-Striping Rows</w:t>
+        <w:t>Task 4: Style Crop Categories Sidebar with Hover Accents</w:t>
+      </w:r>
+    </w:p>
+    <w:p>
+      <w:pPr>
+        <w:spacing w:after="120"/>
+        <w:jc w:val="center"/>
+      </w:pPr>
+      <w:r>
+        <w:drawing>
+          <wp:inline xmlns:a="http://schemas.openxmlformats.org/drawingml/2006/main" xmlns:pic="http://schemas.openxmlformats.org/drawingml/2006/picture">
+            <wp:extent cx="5486400" cy="5852160"/>
+            <wp:docPr id="5" name="Picture 5"/>
+            <wp:cNvGraphicFramePr>
+              <a:graphicFrameLocks noChangeAspect="1"/>
+            </wp:cNvGraphicFramePr>
+            <a:graphic>
+              <a:graphicData uri="http://schemas.openxmlformats.org/drawingml/2006/picture">
+                <pic:pic>
+                  <pic:nvPicPr>
+                    <pic:cNvPr id="0" name="exp2_task4_sidebar.png"/>
+                    <pic:cNvPicPr/>
+                  </pic:nvPicPr>
+                  <pic:blipFill>
+                    <a:blip r:embed="rId13"/>
+                    <a:stretch>
+                      <a:fillRect/>
+                    </a:stretch>
+                  </pic:blipFill>
+                  <pic:spPr>
+                    <a:xfrm>
+                      <a:off x="0" y="0"/>
+                      <a:ext cx="5486400" cy="5852160"/>
+                    </a:xfrm>
+                    <a:prstGeom prst="rect"/>
+                  </pic:spPr>
+                </pic:pic>
+              </a:graphicData>
+            </a:graphic>
+          </wp:inline>
+        </w:drawing>
+      </w:r>
+    </w:p>
+    <w:p>
+      <w:pPr>
+        <w:spacing w:before="160" w:after="40"/>
+      </w:pPr>
+      <w:r>
+        <w:rPr>
+          <w:b/>
+          <w:color w:val="800000"/>
+          <w:sz w:val="20"/>
+        </w:rPr>
+        <w:t>Task 5: Advisory Card Layout Using CSS Box Model (Padding, Border, Shadow)</w:t>
+      </w:r>
+    </w:p>
+    <w:p>
+      <w:pPr>
+        <w:spacing w:after="120"/>
+        <w:jc w:val="center"/>
+      </w:pPr>
+      <w:r>
+        <w:drawing>
+          <wp:inline xmlns:a="http://schemas.openxmlformats.org/drawingml/2006/main" xmlns:pic="http://schemas.openxmlformats.org/drawingml/2006/picture">
+            <wp:extent cx="5486400" cy="1952786"/>
+            <wp:docPr id="6" name="Picture 6"/>
+            <wp:cNvGraphicFramePr>
+              <a:graphicFrameLocks noChangeAspect="1"/>
+            </wp:cNvGraphicFramePr>
+            <a:graphic>
+              <a:graphicData uri="http://schemas.openxmlformats.org/drawingml/2006/picture">
+                <pic:pic>
+                  <pic:nvPicPr>
+                    <pic:cNvPr id="0" name="exp2_task5_boxmodel_cards.png"/>
+                    <pic:cNvPicPr/>
+                  </pic:nvPicPr>
+                  <pic:blipFill>
+                    <a:blip r:embed="rId14"/>
+                    <a:stretch>
+                      <a:fillRect/>
+                    </a:stretch>
+                  </pic:blipFill>
+                  <pic:spPr>
+                    <a:xfrm>
+                      <a:off x="0" y="0"/>
+                      <a:ext cx="5486400" cy="1952786"/>
+                    </a:xfrm>
+                    <a:prstGeom prst="rect"/>
+                  </pic:spPr>
+                </pic:pic>
+              </a:graphicData>
+            </a:graphic>
+          </wp:inline>
+        </w:drawing>
+      </w:r>
+    </w:p>
+    <w:p>
+      <w:pPr>
+        <w:spacing w:before="160" w:after="40"/>
+      </w:pPr>
+      <w:r>
+        <w:rPr>
+          <w:b/>
+          <w:color w:val="800000"/>
+          <w:sz w:val="20"/>
+        </w:rPr>
+        <w:t>Task 6: Precision Agriculture Image Gallery with Hover Zoom Scale</w:t>
+      </w:r>
+    </w:p>
+    <w:p>
+      <w:pPr>
+        <w:spacing w:after="120"/>
+        <w:jc w:val="center"/>
+      </w:pPr>
+      <w:r>
+        <w:drawing>
+          <wp:inline xmlns:a="http://schemas.openxmlformats.org/drawingml/2006/main" xmlns:pic="http://schemas.openxmlformats.org/drawingml/2006/picture">
+            <wp:extent cx="5486400" cy="2092271"/>
+            <wp:docPr id="7" name="Picture 7"/>
+            <wp:cNvGraphicFramePr>
+              <a:graphicFrameLocks noChangeAspect="1"/>
+            </wp:cNvGraphicFramePr>
+            <a:graphic>
+              <a:graphicData uri="http://schemas.openxmlformats.org/drawingml/2006/picture">
+                <pic:pic>
+                  <pic:nvPicPr>
+                    <pic:cNvPr id="0" name="exp2_task6_gallery_hover.png"/>
+                    <pic:cNvPicPr/>
+                  </pic:nvPicPr>
+                  <pic:blipFill>
+                    <a:blip r:embed="rId15"/>
+                    <a:stretch>
+                      <a:fillRect/>
+                    </a:stretch>
+                  </pic:blipFill>
+                  <pic:spPr>
+                    <a:xfrm>
+                      <a:off x="0" y="0"/>
+                      <a:ext cx="5486400" cy="2092271"/>
+                    </a:xfrm>
+                    <a:prstGeom prst="rect"/>
+                  </pic:spPr>
+                </pic:pic>
+              </a:graphicData>
+            </a:graphic>
+          </wp:inline>
+        </w:drawing>
+      </w:r>
+    </w:p>
+    <w:p>
+      <w:pPr>
+        <w:spacing w:before="160" w:after="40"/>
+      </w:pPr>
+      <w:r>
+        <w:rPr>
+          <w:b/>
+          <w:color w:val="800000"/>
+          <w:sz w:val="20"/>
+        </w:rPr>
+        <w:t>Task 7: Styled Irrigation Schedule Table with Zebra-Striping (:nth-child(even))</w:t>
       </w:r>
     </w:p>
     <w:p>
@@ -2901,7 +3060,7 @@
         <w:drawing>
           <wp:inline xmlns:a="http://schemas.openxmlformats.org/drawingml/2006/main" xmlns:pic="http://schemas.openxmlformats.org/drawingml/2006/picture">
             <wp:extent cx="5486400" cy="3429000"/>
-            <wp:docPr id="5" name="Picture 5"/>
+            <wp:docPr id="8" name="Picture 8"/>
             <wp:cNvGraphicFramePr>
               <a:graphicFrameLocks noChangeAspect="1"/>
             </wp:cNvGraphicFramePr>
@@ -2913,7 +3072,7 @@
                     <pic:cNvPicPr/>
                   </pic:nvPicPr>
                   <pic:blipFill>
-                    <a:blip r:embed="rId13"/>
+                    <a:blip r:embed="rId16"/>
                     <a:stretch>
                       <a:fillRect/>
                     </a:stretch>
@@ -2942,7 +3101,7 @@
           <w:color w:val="800000"/>
           <w:sz w:val="20"/>
         </w:rPr>
-        <w:t>Task 8: Styled Farmer Registration Form with Fieldsets &amp; Form Controls</w:t>
+        <w:t>Task 8: Styled Farmer Registration Form with Focus Rings &amp; Fieldsets</w:t>
       </w:r>
     </w:p>
     <w:p>
@@ -2953,8 +3112,8 @@
       <w:r>
         <w:drawing>
           <wp:inline xmlns:a="http://schemas.openxmlformats.org/drawingml/2006/main" xmlns:pic="http://schemas.openxmlformats.org/drawingml/2006/picture">
-            <wp:extent cx="5486400" cy="4738255"/>
-            <wp:docPr id="6" name="Picture 6"/>
+            <wp:extent cx="5486400" cy="4500562"/>
+            <wp:docPr id="9" name="Picture 9"/>
             <wp:cNvGraphicFramePr>
               <a:graphicFrameLocks noChangeAspect="1"/>
             </wp:cNvGraphicFramePr>
@@ -2966,7 +3125,7 @@
                     <pic:cNvPicPr/>
                   </pic:nvPicPr>
                   <pic:blipFill>
-                    <a:blip r:embed="rId14"/>
+                    <a:blip r:embed="rId17"/>
                     <a:stretch>
                       <a:fillRect/>
                     </a:stretch>
@@ -2974,7 +3133,113 @@
                   <pic:spPr>
                     <a:xfrm>
                       <a:off x="0" y="0"/>
-                      <a:ext cx="5486400" cy="4738255"/>
+                      <a:ext cx="5486400" cy="4500562"/>
+                    </a:xfrm>
+                    <a:prstGeom prst="rect"/>
+                  </pic:spPr>
+                </pic:pic>
+              </a:graphicData>
+            </a:graphic>
+          </wp:inline>
+        </w:drawing>
+      </w:r>
+    </w:p>
+    <w:p>
+      <w:pPr>
+        <w:spacing w:before="160" w:after="40"/>
+      </w:pPr>
+      <w:r>
+        <w:rPr>
+          <w:b/>
+          <w:color w:val="800000"/>
+          <w:sz w:val="20"/>
+        </w:rPr>
+        <w:t>Task 9: Page Layout Structure (Two-Column Flexbox/Grid)</w:t>
+      </w:r>
+    </w:p>
+    <w:p>
+      <w:pPr>
+        <w:spacing w:after="120"/>
+        <w:jc w:val="center"/>
+      </w:pPr>
+      <w:r>
+        <w:drawing>
+          <wp:inline xmlns:a="http://schemas.openxmlformats.org/drawingml/2006/main" xmlns:pic="http://schemas.openxmlformats.org/drawingml/2006/picture">
+            <wp:extent cx="5486400" cy="4500562"/>
+            <wp:docPr id="10" name="Picture 10"/>
+            <wp:cNvGraphicFramePr>
+              <a:graphicFrameLocks noChangeAspect="1"/>
+            </wp:cNvGraphicFramePr>
+            <a:graphic>
+              <a:graphicData uri="http://schemas.openxmlformats.org/drawingml/2006/picture">
+                <pic:pic>
+                  <pic:nvPicPr>
+                    <pic:cNvPr id="0" name="exp2_task9_layout.png"/>
+                    <pic:cNvPicPr/>
+                  </pic:nvPicPr>
+                  <pic:blipFill>
+                    <a:blip r:embed="rId18"/>
+                    <a:stretch>
+                      <a:fillRect/>
+                    </a:stretch>
+                  </pic:blipFill>
+                  <pic:spPr>
+                    <a:xfrm>
+                      <a:off x="0" y="0"/>
+                      <a:ext cx="5486400" cy="4500562"/>
+                    </a:xfrm>
+                    <a:prstGeom prst="rect"/>
+                  </pic:spPr>
+                </pic:pic>
+              </a:graphicData>
+            </a:graphic>
+          </wp:inline>
+        </w:drawing>
+      </w:r>
+    </w:p>
+    <w:p>
+      <w:pPr>
+        <w:spacing w:before="160" w:after="40"/>
+      </w:pPr>
+      <w:r>
+        <w:rPr>
+          <w:b/>
+          <w:color w:val="800000"/>
+          <w:sz w:val="20"/>
+        </w:rPr>
+        <w:t>Task 10: CSS Effects &amp; Highlighting (Keyframed Glowing Alert Box)</w:t>
+      </w:r>
+    </w:p>
+    <w:p>
+      <w:pPr>
+        <w:spacing w:after="120"/>
+        <w:jc w:val="center"/>
+      </w:pPr>
+      <w:r>
+        <w:drawing>
+          <wp:inline xmlns:a="http://schemas.openxmlformats.org/drawingml/2006/main" xmlns:pic="http://schemas.openxmlformats.org/drawingml/2006/picture">
+            <wp:extent cx="5486400" cy="1895302"/>
+            <wp:docPr id="11" name="Picture 11"/>
+            <wp:cNvGraphicFramePr>
+              <a:graphicFrameLocks noChangeAspect="1"/>
+            </wp:cNvGraphicFramePr>
+            <a:graphic>
+              <a:graphicData uri="http://schemas.openxmlformats.org/drawingml/2006/picture">
+                <pic:pic>
+                  <pic:nvPicPr>
+                    <pic:cNvPr id="0" name="exp2_task10_css_effects.png"/>
+                    <pic:cNvPicPr/>
+                  </pic:nvPicPr>
+                  <pic:blipFill>
+                    <a:blip r:embed="rId19"/>
+                    <a:stretch>
+                      <a:fillRect/>
+                    </a:stretch>
+                  </pic:blipFill>
+                  <pic:spPr>
+                    <a:xfrm>
+                      <a:off x="0" y="0"/>
+                      <a:ext cx="5486400" cy="1895302"/>
                     </a:xfrm>
                     <a:prstGeom prst="rect"/>
                   </pic:spPr>

</xml_diff>